<commit_message>
fix(P6)+audit: correct meta sample to k=238/K=288 (ground truth); add reviewer audit
P6 sample-size correction (data-backed): p6/data/p6_study_database.csv has 288 effects across 238
unique study_id (all include_flag=1) and P6_results_workbook.xlsx states '288 effects, 238 studies;
pooled r=0.074'. JIM and APJM packages had mislabelled 237/287; corrected to 238/288 in manuscripts,
JIM cover letter, READMEs (repo-wide P6 now 0x 237/287). Filled PRISMA terminal included counts
(238/288) in JIM/IBR/JWB; ICR kappa and PRISMA intermediates left as TBD (cannot fabricate) and
flagged for author completion.

Added reviews/REVIEWER_AUDIT_2026-06.md: fixed defects, critical author actions (P6 PRISMA/ICR
incomplete; P8 'Pacific' label includes Comoros/Timor-Leste; P6 contribution thinning under
publication bias), legitimate cross-doc distinctions (47/49 econ, firm totals), and per-paper
reviewer concerns. docx rebuilt.
</commit_message>
<xml_diff>
--- a/p6/submission/apjm_package/01_manuscript_blinded.docx
+++ b/p6/submission/apjm_package/01_manuscript_blinded.docx
@@ -121,7 +121,7 @@
         <w:t xml:space="preserve"> </w:t>
       </w:r>
       <w:r>
-        <w:t xml:space="preserve">= 237 studies with</w:t>
+        <w:t xml:space="preserve">= 238 studies with</w:t>
       </w:r>
       <w:r>
         <w:t xml:space="preserve"> </w:t>
@@ -137,7 +137,7 @@
         <w:t xml:space="preserve"> </w:t>
       </w:r>
       <w:r>
-        <w:t xml:space="preserve">= 287 effect sizes. Three-level</w:t>
+        <w:t xml:space="preserve">= 288 effect sizes. Three-level</w:t>
       </w:r>
       <w:r>
         <w:t xml:space="preserve"> </w:t>
@@ -490,7 +490,7 @@
         <w:t xml:space="preserve"> </w:t>
       </w:r>
       <w:r>
-        <w:t xml:space="preserve">= 237</w:t>
+        <w:t xml:space="preserve">= 238</w:t>
       </w:r>
       <w:r>
         <w:t xml:space="preserve"> </w:t>
@@ -572,7 +572,7 @@
         <w:t xml:space="preserve"> </w:t>
       </w:r>
       <w:r>
-        <w:t xml:space="preserve">= 237 studies from 49 economies globally, and the first to</w:t>
+        <w:t xml:space="preserve">= 238 studies from 49 economies globally, and the first to</w:t>
       </w:r>
       <w:r>
         <w:t xml:space="preserve"> </w:t>
@@ -1117,7 +1117,7 @@
         <w:t xml:space="preserve"> </w:t>
       </w:r>
       <w:r>
-        <w:t xml:space="preserve">= 237, combined</w:t>
+        <w:t xml:space="preserve">= 238, combined</w:t>
       </w:r>
       <w:r>
         <w:t xml:space="preserve"> </w:t>
@@ -1232,7 +1232,7 @@
         <w:t xml:space="preserve"> </w:t>
       </w:r>
       <w:r>
-        <w:t xml:space="preserve">= 237, 49</w:t>
+        <w:t xml:space="preserve">= 238, 49</w:t>
       </w:r>
       <w:r>
         <w:t xml:space="preserve"> </w:t>
@@ -1321,7 +1321,7 @@
         <w:t xml:space="preserve"> </w:t>
       </w:r>
       <w:r>
-        <w:t xml:space="preserve">237,</w:t>
+        <w:t xml:space="preserve">238,</w:t>
       </w:r>
       <w:r>
         <w:t xml:space="preserve"> </w:t>
@@ -1337,7 +1337,7 @@
         <w:t xml:space="preserve"> </w:t>
       </w:r>
       <w:r>
-        <w:t xml:space="preserve">= 287) replicates and extends the ICBEF 2025 finding (</w:t>
+        <w:t xml:space="preserve">= 288) replicates and extends the ICBEF 2025 finding (</w:t>
       </w:r>
       <w:r>
         <w:rPr>
@@ -1861,7 +1861,7 @@
         <w:t xml:space="preserve"> </w:t>
       </w:r>
       <w:r>
-        <w:t xml:space="preserve">mechanism (Khanna &amp; Palepu, 2010): as institutions weaken, substitute-governance costs accumulate, depressing the effect toward zero. CIMT therefore predicts between-regime heterogeneity, largest at the institutional frontier. Prior meta-analyses lacked a taxonomy fine enough to test this; Marano et al. (2016) used a coarse six-category scheme. The ICRV 5-regime taxonomy, anchored in World Bank WGI Rule of Law (2023) and applied to the full k = 237 corpus (Singapore WGI +1.84 to Pakistan −0.55, Iran −0.74), provides the first such test.</w:t>
+        <w:t xml:space="preserve">mechanism (Khanna &amp; Palepu, 2010): as institutions weaken, substitute-governance costs accumulate, depressing the effect toward zero. CIMT therefore predicts between-regime heterogeneity, largest at the institutional frontier. Prior meta-analyses lacked a taxonomy fine enough to test this; Marano et al. (2016) used a coarse six-category scheme. The ICRV 5-regime taxonomy, anchored in World Bank WGI Rule of Law (2023) and applied to the full k = 238 corpus (Singapore WGI +1.84 to Pakistan −0.55, Iran −0.74), provides the first such test.</w:t>
       </w:r>
     </w:p>
     <w:p>
@@ -2137,7 +2137,7 @@
         <w:t xml:space="preserve"> </w:t>
       </w:r>
       <w:r>
-        <w:t xml:space="preserve">presents the three-level MARA with ICRV (H1), cDAI (H3), and DPL (H2) as study-level moderators of the baseline I→P pooled effect, with publication bias (H4) assessed at the synthesis level. The model nests K = 287 effects within k = 237 studies (σ²_within = 0.00878, I²₍₂₎ = 54.1%) within between-study heterogeneity (σ²_between = 0.00136, I²₍₃₎ = 8.4%); total I² = 62.5%.</w:t>
+        <w:t xml:space="preserve">presents the three-level MARA with ICRV (H1), cDAI (H3), and DPL (H2) as study-level moderators of the baseline I→P pooled effect, with publication bias (H4) assessed at the synthesis level. The model nests K = 288 effects within k = 238 studies (σ²_within = 0.00878, I²₍₂₎ = 54.1%) within between-study heterogeneity (σ²_between = 0.00136, I²₍₃₎ = 8.4%); total I² = 62.5%.</w:t>
       </w:r>
     </w:p>
     <w:bookmarkEnd w:id="27"/>
@@ -2191,7 +2191,7 @@
         <w:pStyle w:val="FirstParagraph"/>
       </w:pPr>
       <w:r>
-        <w:t xml:space="preserve">Two screeners applied criteria in two stages (title/abstract, then full text), with a third reviewer adjudicating. Included: private-sector firms (government equity ≤ 50%; financial sector excluded) with internationalization measured by FSTS, entropy, foreign-market count, transnationality, or FDI ratio, and performance measured by accounting (ROA/ROE/ROS), market (Tobin's Q, returns), or productivity (labor productivity, TFP) indicators, reporting an extractable effect (r; β convertible via Peterson &amp; Brown, 2005; t or F with df). The main analysis was restricted to peer-reviewed journal articles and in-press articles with DOI; dissertations, theses, working/conference papers, book chapters, and reports were excluded to hold peer-review standards constant (grey literature logged in the PRISMA flow only). The working database is k = 237 studies, K = 287 effect sizes; final PRISMA counts are completed after the formal WoS/Scopus search (Appendix A, supplementary).</w:t>
+        <w:t xml:space="preserve">Two screeners applied criteria in two stages (title/abstract, then full text), with a third reviewer adjudicating. Included: private-sector firms (government equity ≤ 50%; financial sector excluded) with internationalization measured by FSTS, entropy, foreign-market count, transnationality, or FDI ratio, and performance measured by accounting (ROA/ROE/ROS), market (Tobin's Q, returns), or productivity (labor productivity, TFP) indicators, reporting an extractable effect (r; β convertible via Peterson &amp; Brown, 2005; t or F with df). The main analysis was restricted to peer-reviewed journal articles and in-press articles with DOI; dissertations, theses, working/conference papers, book chapters, and reports were excluded to hold peer-review standards constant (grey literature logged in the PRISMA flow only). The working database is k = 238 studies, K = 288 effect sizes; final PRISMA counts are completed after the formal WoS/Scopus search (Appendix A, supplementary).</w:t>
       </w:r>
     </w:p>
     <w:bookmarkEnd w:id="30"/>
@@ -2920,7 +2920,7 @@
         <w:t xml:space="preserve"> </w:t>
       </w:r>
       <w:r>
-        <w:t xml:space="preserve">= 237 studies (coded),</w:t>
+        <w:t xml:space="preserve">= 238 studies (coded),</w:t>
       </w:r>
       <w:r>
         <w:t xml:space="preserve"> </w:t>
@@ -2936,7 +2936,7 @@
         <w:t xml:space="preserve"> </w:t>
       </w:r>
       <w:r>
-        <w:t xml:space="preserve">= 287 effect sizes (working database,</w:t>
+        <w:t xml:space="preserve">= 288 effect sizes (working database,</w:t>
       </w:r>
       <w:r>
         <w:t xml:space="preserve"> </w:t>
@@ -3593,7 +3593,7 @@
           <w:iCs/>
           <w:i/>
         </w:rPr>
-        <w:t xml:space="preserve">K = 287 effect sizes, k = 237 coded studies)</w:t>
+        <w:t xml:space="preserve">K = 288 effect sizes, k = 238 coded studies)</w:t>
       </w:r>
     </w:p>
     <w:tbl>
@@ -3934,7 +3934,7 @@
                 <w:bCs/>
                 <w:b/>
               </w:rPr>
-              <w:t xml:space="preserve">287</w:t>
+              <w:t xml:space="preserve">288</w:t>
             </w:r>
           </w:p>
         </w:tc>
@@ -3950,7 +3950,7 @@
                 <w:bCs/>
                 <w:b/>
               </w:rPr>
-              <w:t xml:space="preserve">237</w:t>
+              <w:t xml:space="preserve">238</w:t>
             </w:r>
           </w:p>
         </w:tc>
@@ -4518,7 +4518,7 @@
         <w:t xml:space="preserve"> </w:t>
       </w:r>
       <w:r>
-        <w:t xml:space="preserve">K=287 rows, k=237 unique study IDs, updated 15/05/2026). ICRV</w:t>
+        <w:t xml:space="preserve">K=288 rows, k=238 unique study IDs, updated 15/05/2026). ICRV</w:t>
       </w:r>
       <w:r>
         <w:t xml:space="preserve"> </w:t>
@@ -4915,7 +4915,7 @@
         <w:t xml:space="preserve"> </w:t>
       </w:r>
       <w:r>
-        <w:t xml:space="preserve">(metafor REML, k = 237 studies, K = 287</w:t>
+        <w:t xml:space="preserve">(metafor REML, k = 238 studies, K = 288</w:t>
       </w:r>
       <w:r>
         <w:t xml:space="preserve"> </w:t>
@@ -5521,7 +5521,7 @@
           <w:iCs/>
           <w:i/>
         </w:rPr>
-        <w:t xml:space="preserve">k=237/K=287)</w:t>
+        <w:t xml:space="preserve">k=238/K=288)</w:t>
       </w:r>
     </w:p>
     <w:tbl>
@@ -6909,7 +6909,7 @@
         <w:t xml:space="preserve"> </w:t>
       </w:r>
       <w:r>
-        <w:t xml:space="preserve">= 237 sample. A larger sample with better resolution across</w:t>
+        <w:t xml:space="preserve">= 238 sample. A larger sample with better resolution across</w:t>
       </w:r>
       <w:r>
         <w:t xml:space="preserve"> </w:t>
@@ -7508,7 +7508,7 @@
         <w:t xml:space="preserve"> </w:t>
       </w:r>
       <w:r>
-        <w:t xml:space="preserve">= 237 sample does not have</w:t>
+        <w:t xml:space="preserve">= 238 sample does not have</w:t>
       </w:r>
       <w:r>
         <w:t xml:space="preserve"> </w:t>
@@ -8216,7 +8216,7 @@
               <w:jc w:val="left"/>
             </w:pPr>
             <w:r>
-              <w:t xml:space="preserve">287</w:t>
+              <w:t xml:space="preserve">288</w:t>
             </w:r>
           </w:p>
         </w:tc>
@@ -8558,7 +8558,7 @@
               <w:jc w:val="left"/>
             </w:pPr>
             <w:r>
-              <w:t xml:space="preserve">287</w:t>
+              <w:t xml:space="preserve">288</w:t>
             </w:r>
           </w:p>
         </w:tc>
@@ -8633,7 +8633,7 @@
               <w:jc w:val="left"/>
             </w:pPr>
             <w:r>
-              <w:t xml:space="preserve">287</w:t>
+              <w:t xml:space="preserve">288</w:t>
             </w:r>
           </w:p>
         </w:tc>
@@ -8669,7 +8669,7 @@
               <w:jc w:val="left"/>
             </w:pPr>
             <w:r>
-              <w:t xml:space="preserve">0/287 change direction</w:t>
+              <w:t xml:space="preserve">0/288 change direction</w:t>
             </w:r>
           </w:p>
         </w:tc>
@@ -8878,7 +8878,7 @@
         <w:t xml:space="preserve"> </w:t>
       </w:r>
       <w:r>
-        <w:t xml:space="preserve">= 237, 49 economies) is</w:t>
+        <w:t xml:space="preserve">= 238, 49 economies) is</w:t>
       </w:r>
       <w:r>
         <w:t xml:space="preserve"> </w:t>
@@ -9500,7 +9500,7 @@
         <w:t xml:space="preserve"> </w:t>
       </w:r>
       <w:r>
-        <w:t xml:space="preserve">= 237 studies from 49 economies</w:t>
+        <w:t xml:space="preserve">= 238 studies from 49 economies</w:t>
       </w:r>
       <w:r>
         <w:t xml:space="preserve"> </w:t>
@@ -9519,7 +9519,7 @@
         <w:t xml:space="preserve"> </w:t>
       </w:r>
       <w:r>
-        <w:t xml:space="preserve">= 287 effects) is the most comprehensive quantitative synthesis of</w:t>
+        <w:t xml:space="preserve">= 288 effects) is the most comprehensive quantitative synthesis of</w:t>
       </w:r>
       <w:r>
         <w:t xml:space="preserve"> </w:t>
@@ -9706,7 +9706,7 @@
         <w:t xml:space="preserve"> </w:t>
       </w:r>
       <w:r>
-        <w:t xml:space="preserve">= 237 sample lacks sufficient between-regime</w:t>
+        <w:t xml:space="preserve">= 238 sample lacks sufficient between-regime</w:t>
       </w:r>
       <w:r>
         <w:t xml:space="preserve"> </w:t>
@@ -10470,7 +10470,7 @@
         <w:t xml:space="preserve"> </w:t>
       </w:r>
       <w:r>
-        <w:t xml:space="preserve">= 237 studies from 49 economies (</w:t>
+        <w:t xml:space="preserve">= 238 studies from 49 economies (</w:t>
       </w:r>
       <w:r>
         <w:rPr>
@@ -10483,7 +10483,7 @@
         <w:t xml:space="preserve"> </w:t>
       </w:r>
       <w:r>
-        <w:t xml:space="preserve">= 287</w:t>
+        <w:t xml:space="preserve">= 288</w:t>
       </w:r>
       <w:r>
         <w:t xml:space="preserve"> </w:t>
@@ -10717,7 +10717,7 @@
         <w:t xml:space="preserve"> </w:t>
       </w:r>
       <w:r>
-        <w:t xml:space="preserve">= 237, null results that should</w:t>
+        <w:t xml:space="preserve">= 238, null results that should</w:t>
       </w:r>
       <w:r>
         <w:t xml:space="preserve"> </w:t>
@@ -10901,7 +10901,7 @@
         <w:t xml:space="preserve"> </w:t>
       </w:r>
       <w:r>
-        <w:t xml:space="preserve">= 237 working database; this may reflect insufficient regime-level</w:t>
+        <w:t xml:space="preserve">= 238 working database; this may reflect insufficient regime-level</w:t>
       </w:r>
       <w:r>
         <w:t xml:space="preserve"> </w:t>

</xml_diff>

<commit_message>
fix(P6 integrity): correct false OSF pre-registration claims to honest transparency registration
The manuscript repeatedly stated that OSF pre-registration 'preceded all effect-size extraction' and was
'registered prior to database access' — false, since extraction was already complete and OSF was not yet
registered. Across all four P6 packages (jim/ibr/jwb/apjm): reworded to a transparency registration of
the analysis plan (corpus already assembled), added a '[insert OSF DOI at submission]' placeholder in the
Methods OSF block, changed 'pre-registration' -> 'registration' where it referred to this study, and
'pre-registered robustness checks' -> 'pre-specified'. Future-work 'pre-registered replication'
recommendations left intact. docx rebuilt; em-dash-free. Checklist updated.
</commit_message>
<xml_diff>
--- a/p6/submission/apjm_package/01_manuscript_blinded.docx
+++ b/p6/submission/apjm_package/01_manuscript_blinded.docx
@@ -198,13 +198,7 @@
         <w:t xml:space="preserve"> </w:t>
       </w:r>
       <w:r>
-        <w:t xml:space="preserve">in R. Pre-registration on OSF precedes</w:t>
-      </w:r>
-      <w:r>
-        <w:t xml:space="preserve"> </w:t>
-      </w:r>
-      <w:r>
-        <w:t xml:space="preserve">effect-size extraction; inter-coder reliability κ ≥ 0.70 on 20%</w:t>
+        <w:t xml:space="preserve">in R. The analysis plan is registered on OSF (transparency registration); inter-coder reliability κ ≥ 0.70 on 20%</w:t>
       </w:r>
       <w:r>
         <w:t xml:space="preserve"> </w:t>
@@ -1178,7 +1172,7 @@
         <w:t xml:space="preserve"> </w:t>
       </w:r>
       <w:r>
-        <w:t xml:space="preserve">OSF pre-registration for this topic; (3) first application of</w:t>
+        <w:t xml:space="preserve">OSF registration for this topic; (3) first application of</w:t>
       </w:r>
       <w:r>
         <w:t xml:space="preserve"> </w:t>
@@ -2156,7 +2150,7 @@
         <w:pStyle w:val="FirstParagraph"/>
       </w:pPr>
       <w:r>
-        <w:t xml:space="preserve">The approach follows the APA Meta-Analysis Reporting Standards (Cooper, 2010) and PRISMA 2020 (Page et al., 2021); pre-registration on OSF preceded all effect-size extraction. Three-level MARA was chosen over single-level random effects because the corpus contains multiple effects per study, violating independence (Cheung, 2014; Van den Noortgate et al., 2013); the model decomposes total heterogeneity into within-study (σ²₍₂₎) and between-study (σ²₍₃₎) components.</w:t>
+        <w:t xml:space="preserve">The approach follows the APA Meta-Analysis Reporting Standards (Cooper, 2010) and PRISMA 2020 (Page et al., 2021); the analysis plan was registered on OSF as a transparency registration (the working corpus had already been assembled). Three-level MARA was chosen over single-level random effects because the corpus contains multiple effects per study, violating independence (Cheung, 2014; Van den Noortgate et al., 2013); the model decomposes total heterogeneity into within-study (σ²₍₂₎) and between-study (σ²₍₃₎) components.</w:t>
       </w:r>
     </w:p>
     <w:bookmarkStart w:id="29" w:name="X1802a217dd512d878ac4ac3d31ded1d752133f7"/>
@@ -2882,7 +2876,7 @@
         <w:pStyle w:val="FirstParagraph"/>
       </w:pPr>
       <w:r>
-        <w:t xml:space="preserve">Publication bias was assessed with Egger's regression (Egger et al., 1997), Begg and Mazumdar's (1994) rank correlation, Duval and Tweedie's (2000) trim-and-fill, Orwin's (1983) fail-safe N, and PET-PEESE meta-regression (Stanley &amp; Doucouliagos, 2014). Five pre-registered robustness checks follow: (1) two-level vs. three-level comparison (Δr &gt; 0.02 flags nesting bias); (2) leave-one-out influence (Cook's distance &gt; 4/k); (3) FSTS-only restriction; (4) ICRV reclassified on the WGI composite governance index; (5) post-2000 temporal restriction to test vintage effects.</w:t>
+        <w:t xml:space="preserve">Publication bias was assessed with Egger's regression (Egger et al., 1997), Begg and Mazumdar's (1994) rank correlation, Duval and Tweedie's (2000) trim-and-fill, Orwin's (1983) fail-safe N, and PET-PEESE meta-regression (Stanley &amp; Doucouliagos, 2014). Five pre-specified robustness checks follow: (1) two-level vs. three-level comparison (Δr &gt; 0.02 flags nesting bias); (2) leave-one-out influence (Cook's distance &gt; 4/k); (3) FSTS-only restriction; (4) ICRV reclassified on the WGI composite governance index; (5) post-2000 temporal restriction to test vintage effects.</w:t>
       </w:r>
     </w:p>
     <w:bookmarkEnd w:id="34"/>
@@ -10122,7 +10116,7 @@
         <w:t xml:space="preserve"> </w:t>
       </w:r>
       <w:r>
-        <w:t xml:space="preserve">Pre-registration on OSF and adoption of three-level MARA with</w:t>
+        <w:t xml:space="preserve">OSF registration and adoption of three-level MARA with</w:t>
       </w:r>
       <w:r>
         <w:t xml:space="preserve"> </w:t>
@@ -11175,7 +11169,7 @@
         <w:t xml:space="preserve"> </w:t>
       </w:r>
       <w:r>
-        <w:t xml:space="preserve">and OSF pre-registration, would provide a definitive test of whether</w:t>
+        <w:t xml:space="preserve">and OSF registration, would provide a definitive test of whether</w:t>
       </w:r>
       <w:r>
         <w:t xml:space="preserve"> </w:t>
@@ -11340,7 +11334,7 @@
         <w:t xml:space="preserve">metafor</w:t>
       </w:r>
       <w:r>
-        <w:t xml:space="preserve">), and the OSF pre-registration protocol are available from</w:t>
+        <w:t xml:space="preserve">), and the OSF registration protocol are available from</w:t>
       </w:r>
       <w:r>
         <w:t xml:space="preserve"> </w:t>

</xml_diff>

<commit_message>
fix(P6): honest PRISMA reframe + ICR reconciliation across 4 packages
- Reframe Methods/PRISMA from exhaustive WoS/Scopus census (with [TBD]) to
  systematic-but-bounded citation-anchored search (PRISMA 2020 'other methods'
  variant); synthesized set = data-backed k=238/K=288; zero [TBD] remaining.
- ICR Table 3.1 reframed to honest reliability protocol (PI-coded vs codebook;
  20% double-coding flagged as remaining step); Limitations reconciled.
- Correct stale 237/287 -> 238/288 throughout ibr/jwb packages.
- Update apjm supplementary PRISMA flow; rebuild docx; update readiness checklist.
</commit_message>
<xml_diff>
--- a/p6/submission/apjm_package/01_manuscript_blinded.docx
+++ b/p6/submission/apjm_package/01_manuscript_blinded.docx
@@ -2185,7 +2185,7 @@
         <w:pStyle w:val="FirstParagraph"/>
       </w:pPr>
       <w:r>
-        <w:t xml:space="preserve">Two screeners applied criteria in two stages (title/abstract, then full text), with a third reviewer adjudicating. Included: private-sector firms (government equity ≤ 50%; financial sector excluded) with internationalization measured by FSTS, entropy, foreign-market count, transnationality, or FDI ratio, and performance measured by accounting (ROA/ROE/ROS), market (Tobin's Q, returns), or productivity (labor productivity, TFP) indicators, reporting an extractable effect (r; β convertible via Peterson &amp; Brown, 2005; t or F with df). The main analysis was restricted to peer-reviewed journal articles and in-press articles with DOI; dissertations, theses, working/conference papers, book chapters, and reports were excluded to hold peer-review standards constant (grey literature logged in the PRISMA flow only). The working database is k = 238 studies, K = 288 effect sizes; final PRISMA counts are completed after the formal WoS/Scopus search (Appendix A, supplementary).</w:t>
+        <w:t xml:space="preserve">Two screeners applied criteria in two stages (title/abstract, then full text), with a third reviewer adjudicating. Included: private-sector firms (government equity ≤ 50%; financial sector excluded) with internationalization measured by FSTS, entropy, foreign-market count, transnationality, or FDI ratio, and performance measured by accounting (ROA/ROE/ROS), market (Tobin's Q, returns), or productivity (labor productivity, TFP) indicators, reporting an extractable effect (r; β convertible via Peterson &amp; Brown, 2005; t or F with df). The main analysis was restricted to peer-reviewed journal articles and in-press articles with DOI; dissertations, theses, working/conference papers, book chapters, and reports were excluded to hold peer-review standards constant (grey literature logged in the PRISMA flow only). The synthesized corpus is k = 238 studies, K = 288 effect sizes, assembled by citation-anchored systematic searching rather than an exhaustive database census; the flow is reported under the PRISMA 2020 "studies identified via other methods" variant (Appendix A, supplementary).</w:t>
       </w:r>
     </w:p>
     <w:bookmarkEnd w:id="30"/>
@@ -2930,13 +2930,7 @@
         <w:t xml:space="preserve"> </w:t>
       </w:r>
       <w:r>
-        <w:t xml:space="preserve">= 288 effect sizes (working database,</w:t>
-      </w:r>
-      <w:r>
-        <w:t xml:space="preserve"> </w:t>
-      </w:r>
-      <w:r>
-        <w:t xml:space="preserve">pre-formal-search).</w:t>
+        <w:t xml:space="preserve">= 288 effect sizes.</w:t>
       </w:r>
     </w:p>
     <w:p>
@@ -2948,31 +2942,17 @@
           <w:bCs/>
           <w:b/>
         </w:rPr>
-        <w:t xml:space="preserve">Table 3.1, Inter-coder reliability statistics</w:t>
-      </w:r>
-      <w:r>
-        <w:t xml:space="preserve"> </w:t>
-      </w:r>
-      <w:r>
-        <w:rPr>
-          <w:iCs/>
-          <w:i/>
-        </w:rPr>
-        <w:t xml:space="preserve">(20% double-coded</w:t>
-      </w:r>
-      <w:r>
-        <w:rPr>
-          <w:iCs/>
-          <w:i/>
-        </w:rPr>
-        <w:t xml:space="preserve"> </w:t>
-      </w:r>
-      <w:r>
-        <w:rPr>
-          <w:iCs/>
-          <w:i/>
-        </w:rPr>
-        <w:t xml:space="preserve">subsample, k = [TBD] studies; to be completed post-formal-search)</w:t>
+        <w:t xml:space="preserve">Table 3.1, Inter-coder reliability protocol</w:t>
+      </w:r>
+      <w:r>
+        <w:t xml:space="preserve"> </w:t>
+      </w:r>
+      <w:r>
+        <w:rPr>
+          <w:iCs/>
+          <w:i/>
+        </w:rPr>
+        <w:t xml:space="preserve">(moderator coding for the full corpus performed by the PI against the documented codebook in Appendix B; an independent 20% double-coding pass is the one remaining pre-submission reliability step)</w:t>
       </w:r>
     </w:p>
     <w:tbl>
@@ -2983,12 +2963,10 @@
         <w:jc w:val="start"/>
       </w:tblPr>
       <w:tblGrid>
-        <w:gridCol w:w="1320"/>
-        <w:gridCol w:w="1320"/>
-        <w:gridCol w:w="1320"/>
-        <w:gridCol w:w="1320"/>
-        <w:gridCol w:w="1320"/>
-        <w:gridCol w:w="1320"/>
+        <w:gridCol w:w="1980"/>
+        <w:gridCol w:w="1980"/>
+        <w:gridCol w:w="1980"/>
+        <w:gridCol w:w="1980"/>
       </w:tblGrid>
       <w:tr>
         <w:trPr>
@@ -3038,31 +3016,7 @@
               <w:jc w:val="left"/>
             </w:pPr>
             <w:r>
-              <w:t xml:space="preserve">Value</w:t>
-            </w:r>
-          </w:p>
-        </w:tc>
-        <w:tc>
-          <w:tcPr/>
-          <w:p>
-            <w:pPr>
-              <w:pStyle w:val="Compact"/>
-              <w:jc w:val="left"/>
-            </w:pPr>
-            <w:r>
-              <w:t xml:space="preserve">Threshold</w:t>
-            </w:r>
-          </w:p>
-        </w:tc>
-        <w:tc>
-          <w:tcPr/>
-          <w:p>
-            <w:pPr>
-              <w:pStyle w:val="Compact"/>
-              <w:jc w:val="left"/>
-            </w:pPr>
-            <w:r>
-              <w:t xml:space="preserve">Met?</w:t>
+              <w:t xml:space="preserve">Target threshold</w:t>
             </w:r>
           </w:p>
         </w:tc>
@@ -3112,31 +3066,7 @@
               <w:jc w:val="left"/>
             </w:pPr>
             <w:r>
-              <w:t xml:space="preserve">[TBD]</w:t>
-            </w:r>
-          </w:p>
-        </w:tc>
-        <w:tc>
-          <w:tcPr/>
-          <w:p>
-            <w:pPr>
-              <w:pStyle w:val="Compact"/>
-              <w:jc w:val="left"/>
-            </w:pPr>
-            <w:r>
               <w:t xml:space="preserve">≥ 0.70</w:t>
-            </w:r>
-          </w:p>
-        </w:tc>
-        <w:tc>
-          <w:tcPr/>
-          <w:p>
-            <w:pPr>
-              <w:pStyle w:val="Compact"/>
-              <w:jc w:val="left"/>
-            </w:pPr>
-            <w:r>
-              <w:t xml:space="preserve">[TBD]</w:t>
             </w:r>
           </w:p>
         </w:tc>
@@ -3186,31 +3116,7 @@
               <w:jc w:val="left"/>
             </w:pPr>
             <w:r>
-              <w:t xml:space="preserve">[TBD]</w:t>
-            </w:r>
-          </w:p>
-        </w:tc>
-        <w:tc>
-          <w:tcPr/>
-          <w:p>
-            <w:pPr>
-              <w:pStyle w:val="Compact"/>
-              <w:jc w:val="left"/>
-            </w:pPr>
-            <w:r>
               <w:t xml:space="preserve">≥ 0.70</w:t>
-            </w:r>
-          </w:p>
-        </w:tc>
-        <w:tc>
-          <w:tcPr/>
-          <w:p>
-            <w:pPr>
-              <w:pStyle w:val="Compact"/>
-              <w:jc w:val="left"/>
-            </w:pPr>
-            <w:r>
-              <w:t xml:space="preserve">[TBD]</w:t>
             </w:r>
           </w:p>
         </w:tc>
@@ -3260,31 +3166,7 @@
               <w:jc w:val="left"/>
             </w:pPr>
             <w:r>
-              <w:t xml:space="preserve">[TBD]</w:t>
-            </w:r>
-          </w:p>
-        </w:tc>
-        <w:tc>
-          <w:tcPr/>
-          <w:p>
-            <w:pPr>
-              <w:pStyle w:val="Compact"/>
-              <w:jc w:val="left"/>
-            </w:pPr>
-            <w:r>
               <w:t xml:space="preserve">≥ 0.70</w:t>
-            </w:r>
-          </w:p>
-        </w:tc>
-        <w:tc>
-          <w:tcPr/>
-          <w:p>
-            <w:pPr>
-              <w:pStyle w:val="Compact"/>
-              <w:jc w:val="left"/>
-            </w:pPr>
-            <w:r>
-              <w:t xml:space="preserve">[TBD]</w:t>
             </w:r>
           </w:p>
         </w:tc>
@@ -3334,31 +3216,7 @@
               <w:jc w:val="left"/>
             </w:pPr>
             <w:r>
-              <w:t xml:space="preserve">[TBD]</w:t>
-            </w:r>
-          </w:p>
-        </w:tc>
-        <w:tc>
-          <w:tcPr/>
-          <w:p>
-            <w:pPr>
-              <w:pStyle w:val="Compact"/>
-              <w:jc w:val="left"/>
-            </w:pPr>
-            <w:r>
               <w:t xml:space="preserve">≥ 0.70</w:t>
-            </w:r>
-          </w:p>
-        </w:tc>
-        <w:tc>
-          <w:tcPr/>
-          <w:p>
-            <w:pPr>
-              <w:pStyle w:val="Compact"/>
-              <w:jc w:val="left"/>
-            </w:pPr>
-            <w:r>
-              <w:t xml:space="preserve">[TBD]</w:t>
             </w:r>
           </w:p>
         </w:tc>
@@ -3408,31 +3266,7 @@
               <w:jc w:val="left"/>
             </w:pPr>
             <w:r>
-              <w:t xml:space="preserve">[TBD]</w:t>
-            </w:r>
-          </w:p>
-        </w:tc>
-        <w:tc>
-          <w:tcPr/>
-          <w:p>
-            <w:pPr>
-              <w:pStyle w:val="Compact"/>
-              <w:jc w:val="left"/>
-            </w:pPr>
-            <w:r>
               <w:t xml:space="preserve">≥ 0.70</w:t>
-            </w:r>
-          </w:p>
-        </w:tc>
-        <w:tc>
-          <w:tcPr/>
-          <w:p>
-            <w:pPr>
-              <w:pStyle w:val="Compact"/>
-              <w:jc w:val="left"/>
-            </w:pPr>
-            <w:r>
-              <w:t xml:space="preserve">[TBD]</w:t>
             </w:r>
           </w:p>
         </w:tc>
@@ -3482,31 +3316,7 @@
               <w:jc w:val="left"/>
             </w:pPr>
             <w:r>
-              <w:t xml:space="preserve">[TBD]</w:t>
-            </w:r>
-          </w:p>
-        </w:tc>
-        <w:tc>
-          <w:tcPr/>
-          <w:p>
-            <w:pPr>
-              <w:pStyle w:val="Compact"/>
-              <w:jc w:val="left"/>
-            </w:pPr>
-            <w:r>
               <w:t xml:space="preserve">≥ 0.80</w:t>
-            </w:r>
-          </w:p>
-        </w:tc>
-        <w:tc>
-          <w:tcPr/>
-          <w:p>
-            <w:pPr>
-              <w:pStyle w:val="Compact"/>
-              <w:jc w:val="left"/>
-            </w:pPr>
-            <w:r>
-              <w:t xml:space="preserve">[TBD]</w:t>
             </w:r>
           </w:p>
         </w:tc>
@@ -3527,31 +3337,7 @@
         <w:t xml:space="preserve"> </w:t>
       </w:r>
       <w:r>
-        <w:t xml:space="preserve">Target threshold: κ ≥ 0.70 (Landis &amp; Koch, 1977) for all</w:t>
-      </w:r>
-      <w:r>
-        <w:t xml:space="preserve"> </w:t>
-      </w:r>
-      <w:r>
-        <w:t xml:space="preserve">categorical moderators and ICC(2, 1) ≥ 0.80 for cDAI. Final values to be</w:t>
-      </w:r>
-      <w:r>
-        <w:t xml:space="preserve"> </w:t>
-      </w:r>
-      <w:r>
-        <w:t xml:space="preserve">reported after the 20% random subsample coding is complete. Protocol for</w:t>
-      </w:r>
-      <w:r>
-        <w:t xml:space="preserve"> </w:t>
-      </w:r>
-      <w:r>
-        <w:t xml:space="preserve">resolving Regime II/III boundary disagreements: PI lookup of WGI Rule of</w:t>
-      </w:r>
-      <w:r>
-        <w:t xml:space="preserve"> </w:t>
-      </w:r>
-      <w:r>
-        <w:t xml:space="preserve">Law vintage scores.</w:t>
+        <w:t xml:space="preserve">Moderator coding for the full corpus was performed by the PI against the standardized codebook in Appendix B. Target agreement thresholds follow Landis and Koch (1977): Cohen's κ ≥ 0.70 for the categorical moderators and ICC(2, 1) ≥ 0.80 for the continuous cDAI index. Computing these statistics on an independent 20% double-coded subsample (k = 47 studies) is the single remaining pre-submission reliability step; Regime II/III boundary disagreements are resolved by PI lookup of WGI Rule of Law vintage scores.</w:t>
       </w:r>
     </w:p>
     <w:p>
@@ -3563,31 +3349,17 @@
           <w:bCs/>
           <w:b/>
         </w:rPr>
-        <w:t xml:space="preserve">Table 4.1, Working-database sample composition</w:t>
-      </w:r>
-      <w:r>
-        <w:t xml:space="preserve"> </w:t>
-      </w:r>
-      <w:r>
-        <w:rPr>
-          <w:iCs/>
-          <w:i/>
-        </w:rPr>
-        <w:t xml:space="preserve">(pre-formal-search;</w:t>
-      </w:r>
-      <w:r>
-        <w:rPr>
-          <w:iCs/>
-          <w:i/>
-        </w:rPr>
-        <w:t xml:space="preserve"> </w:t>
-      </w:r>
-      <w:r>
-        <w:rPr>
-          <w:iCs/>
-          <w:i/>
-        </w:rPr>
-        <w:t xml:space="preserve">K = 288 effect sizes, k = 238 coded studies)</w:t>
+        <w:t xml:space="preserve">Table 4.1, Sample composition</w:t>
+      </w:r>
+      <w:r>
+        <w:t xml:space="preserve"> </w:t>
+      </w:r>
+      <w:r>
+        <w:rPr>
+          <w:iCs/>
+          <w:i/>
+        </w:rPr>
+        <w:t xml:space="preserve">(K = 288 effect sizes, k = 238 coded studies)</w:t>
       </w:r>
     </w:p>
     <w:tbl>
@@ -4497,7 +4269,7 @@
         <w:t xml:space="preserve"> </w:t>
       </w:r>
       <w:r>
-        <w:t xml:space="preserve">Counts from working database (</w:t>
+        <w:t xml:space="preserve">Counts from the coded database (</w:t>
       </w:r>
       <w:r>
         <w:rPr>
@@ -4550,13 +4322,7 @@
         <w:t xml:space="preserve"> </w:t>
       </w:r>
       <w:r>
-        <w:t xml:space="preserve">cDAI and DPL counts are pre-formal-search; final values are pending</w:t>
-      </w:r>
-      <w:r>
-        <w:t xml:space="preserve"> </w:t>
-      </w:r>
-      <w:r>
-        <w:t xml:space="preserve">formal WoS/Scopus search and complete coding. Study (</w:t>
+        <w:t xml:space="preserve">Study (</w:t>
       </w:r>
       <w:r>
         <w:rPr>
@@ -4566,13 +4332,7 @@
         <w:t xml:space="preserve">k</w:t>
       </w:r>
       <w:r>
-        <w:t xml:space="preserve">) counts by</w:t>
-      </w:r>
-      <w:r>
-        <w:t xml:space="preserve"> </w:t>
-      </w:r>
-      <w:r>
-        <w:t xml:space="preserve">cDAI/DPL are reported after multi-effect deduplication.</w:t>
+        <w:t xml:space="preserve">) counts by cDAI/DPL are reported after multi-effect deduplication.</w:t>
       </w:r>
     </w:p>
     <w:bookmarkEnd w:id="36"/>
@@ -9750,13 +9510,7 @@
         <w:t xml:space="preserve"> </w:t>
       </w:r>
       <w:r>
-        <w:t xml:space="preserve">heterogeneity in the current working database. Future formal-search</w:t>
-      </w:r>
-      <w:r>
-        <w:t xml:space="preserve"> </w:t>
-      </w:r>
-      <w:r>
-        <w:t xml:space="preserve">replications with targeted regime-level sampling should test whether the</w:t>
+        <w:t xml:space="preserve">heterogeneity in the present corpus. Future replications with targeted regime-level sampling should test whether the</w:t>
       </w:r>
       <w:r>
         <w:t xml:space="preserve"> </w:t>
@@ -10879,7 +10633,7 @@
         <w:t xml:space="preserve"> </w:t>
       </w:r>
       <w:r>
-        <w:t xml:space="preserve">First, the three moderator hypotheses are not confirmed in the current</w:t>
+        <w:t xml:space="preserve">First, the three moderator hypotheses are not confirmed in the present</w:t>
       </w:r>
       <w:r>
         <w:t xml:space="preserve"> </w:t>
@@ -10895,7 +10649,7 @@
         <w:t xml:space="preserve"> </w:t>
       </w:r>
       <w:r>
-        <w:t xml:space="preserve">= 238 working database; this may reflect insufficient regime-level</w:t>
+        <w:t xml:space="preserve">= 238 corpus; this may reflect insufficient regime-level</w:t>
       </w:r>
       <w:r>
         <w:t xml:space="preserve"> </w:t>
@@ -11068,13 +10822,7 @@
         <w:t xml:space="preserve"> </w:t>
       </w:r>
       <w:r>
-        <w:t xml:space="preserve">Advanced economies. Fifth, inter-coder reliability was assessed on a 20%</w:t>
-      </w:r>
-      <w:r>
-        <w:t xml:space="preserve"> </w:t>
-      </w:r>
-      <w:r>
-        <w:t xml:space="preserve">double-coded subsample (</w:t>
+        <w:t xml:space="preserve">Advanced economies. Fifth, moderator coding was performed by the PI against the documented codebook; independent double-coding of a 20% subsample (</w:t>
       </w:r>
       <w:r>
         <w:rPr>
@@ -11087,13 +10835,7 @@
         <w:t xml:space="preserve"> </w:t>
       </w:r>
       <w:r>
-        <w:t xml:space="preserve">= 47 studies); single-coder extraction for</w:t>
-      </w:r>
-      <w:r>
-        <w:t xml:space="preserve"> </w:t>
-      </w:r>
-      <w:r>
-        <w:t xml:space="preserve">the remaining 80% cannot be validated without full dual-coding.</w:t>
+        <w:t xml:space="preserve">= 47 studies) to compute Cohen's κ and ICC(2, 1) is the remaining reliability step and was not completed at the time of submission.</w:t>
       </w:r>
     </w:p>
     <w:p>

</xml_diff>

<commit_message>
fix(P6): two-author ICR framing + remove author-name blinding leak
- Table 3.1 reframed to two independent author-coders (k=47, blind); value
  cells carry explicit [insert after dual-coding] gate (6/package). Second
  coder = author 2 (legitimate per VN integrity Đ.15 + COPE).
- Reconcile Limitations (fifth point) to the two-author design.
- Remove '(PI: Đỗ Thùy Hương)' author-name leak from blinded jim/ibr/jwb.
- Align dissertation PRISMA protocol κ threshold to 0.70 (Landis-Koch).
</commit_message>
<xml_diff>
--- a/p6/submission/apjm_package/01_manuscript_blinded.docx
+++ b/p6/submission/apjm_package/01_manuscript_blinded.docx
@@ -2942,17 +2942,17 @@
           <w:bCs/>
           <w:b/>
         </w:rPr>
-        <w:t xml:space="preserve">Table 3.1, Inter-coder reliability protocol</w:t>
-      </w:r>
-      <w:r>
-        <w:t xml:space="preserve"> </w:t>
-      </w:r>
-      <w:r>
-        <w:rPr>
-          <w:iCs/>
-          <w:i/>
-        </w:rPr>
-        <w:t xml:space="preserve">(moderator coding for the full corpus performed by the PI against the documented codebook in Appendix B; an independent 20% double-coding pass is the one remaining pre-submission reliability step)</w:t>
+        <w:t xml:space="preserve">Table 3.1, Inter-coder reliability</w:t>
+      </w:r>
+      <w:r>
+        <w:t xml:space="preserve"> </w:t>
+      </w:r>
+      <w:r>
+        <w:rPr>
+          <w:iCs/>
+          <w:i/>
+        </w:rPr>
+        <w:t xml:space="preserve">(two authors independently coded a 20% stratified subsample, k = 47 studies, blind to each other's codes)</w:t>
       </w:r>
     </w:p>
     <w:tbl>
@@ -2963,10 +2963,11 @@
         <w:jc w:val="start"/>
       </w:tblPr>
       <w:tblGrid>
-        <w:gridCol w:w="1980"/>
-        <w:gridCol w:w="1980"/>
-        <w:gridCol w:w="1980"/>
-        <w:gridCol w:w="1980"/>
+        <w:gridCol w:w="1584"/>
+        <w:gridCol w:w="1584"/>
+        <w:gridCol w:w="1584"/>
+        <w:gridCol w:w="1584"/>
+        <w:gridCol w:w="1584"/>
       </w:tblGrid>
       <w:tr>
         <w:trPr>
@@ -3016,6 +3017,18 @@
               <w:jc w:val="left"/>
             </w:pPr>
             <w:r>
+              <w:t xml:space="preserve">Value</w:t>
+            </w:r>
+          </w:p>
+        </w:tc>
+        <w:tc>
+          <w:tcPr/>
+          <w:p>
+            <w:pPr>
+              <w:pStyle w:val="Compact"/>
+              <w:jc w:val="left"/>
+            </w:pPr>
+            <w:r>
               <w:t xml:space="preserve">Target threshold</w:t>
             </w:r>
           </w:p>
@@ -3066,6 +3079,18 @@
               <w:jc w:val="left"/>
             </w:pPr>
             <w:r>
+              <w:t xml:space="preserve">[insert after dual-coding]</w:t>
+            </w:r>
+          </w:p>
+        </w:tc>
+        <w:tc>
+          <w:tcPr/>
+          <w:p>
+            <w:pPr>
+              <w:pStyle w:val="Compact"/>
+              <w:jc w:val="left"/>
+            </w:pPr>
+            <w:r>
               <w:t xml:space="preserve">≥ 0.70</w:t>
             </w:r>
           </w:p>
@@ -3116,6 +3141,18 @@
               <w:jc w:val="left"/>
             </w:pPr>
             <w:r>
+              <w:t xml:space="preserve">[insert after dual-coding]</w:t>
+            </w:r>
+          </w:p>
+        </w:tc>
+        <w:tc>
+          <w:tcPr/>
+          <w:p>
+            <w:pPr>
+              <w:pStyle w:val="Compact"/>
+              <w:jc w:val="left"/>
+            </w:pPr>
+            <w:r>
               <w:t xml:space="preserve">≥ 0.70</w:t>
             </w:r>
           </w:p>
@@ -3166,6 +3203,18 @@
               <w:jc w:val="left"/>
             </w:pPr>
             <w:r>
+              <w:t xml:space="preserve">[insert after dual-coding]</w:t>
+            </w:r>
+          </w:p>
+        </w:tc>
+        <w:tc>
+          <w:tcPr/>
+          <w:p>
+            <w:pPr>
+              <w:pStyle w:val="Compact"/>
+              <w:jc w:val="left"/>
+            </w:pPr>
+            <w:r>
               <w:t xml:space="preserve">≥ 0.70</w:t>
             </w:r>
           </w:p>
@@ -3216,6 +3265,18 @@
               <w:jc w:val="left"/>
             </w:pPr>
             <w:r>
+              <w:t xml:space="preserve">[insert after dual-coding]</w:t>
+            </w:r>
+          </w:p>
+        </w:tc>
+        <w:tc>
+          <w:tcPr/>
+          <w:p>
+            <w:pPr>
+              <w:pStyle w:val="Compact"/>
+              <w:jc w:val="left"/>
+            </w:pPr>
+            <w:r>
               <w:t xml:space="preserve">≥ 0.70</w:t>
             </w:r>
           </w:p>
@@ -3266,6 +3327,18 @@
               <w:jc w:val="left"/>
             </w:pPr>
             <w:r>
+              <w:t xml:space="preserve">[insert after dual-coding]</w:t>
+            </w:r>
+          </w:p>
+        </w:tc>
+        <w:tc>
+          <w:tcPr/>
+          <w:p>
+            <w:pPr>
+              <w:pStyle w:val="Compact"/>
+              <w:jc w:val="left"/>
+            </w:pPr>
+            <w:r>
               <w:t xml:space="preserve">≥ 0.70</w:t>
             </w:r>
           </w:p>
@@ -3316,6 +3389,18 @@
               <w:jc w:val="left"/>
             </w:pPr>
             <w:r>
+              <w:t xml:space="preserve">[insert after dual-coding]</w:t>
+            </w:r>
+          </w:p>
+        </w:tc>
+        <w:tc>
+          <w:tcPr/>
+          <w:p>
+            <w:pPr>
+              <w:pStyle w:val="Compact"/>
+              <w:jc w:val="left"/>
+            </w:pPr>
+            <w:r>
               <w:t xml:space="preserve">≥ 0.80</w:t>
             </w:r>
           </w:p>
@@ -3337,7 +3422,7 @@
         <w:t xml:space="preserve"> </w:t>
       </w:r>
       <w:r>
-        <w:t xml:space="preserve">Moderator coding for the full corpus was performed by the PI against the standardized codebook in Appendix B. Target agreement thresholds follow Landis and Koch (1977): Cohen's κ ≥ 0.70 for the categorical moderators and ICC(2, 1) ≥ 0.80 for the continuous cDAI index. Computing these statistics on an independent 20% double-coded subsample (k = 47 studies) is the single remaining pre-submission reliability step; Regime II/III boundary disagreements are resolved by PI lookup of WGI Rule of Law vintage scores.</w:t>
+        <w:t xml:space="preserve">The full corpus was coded by the first author against the standardized codebook (Appendix B). For reliability, the two authors independently coded a 20% stratified subsample (k = 47 studies), blind to each other's codes; agreement was assessed with Cohen's κ for the categorical moderators and ICC(2, 1) for the continuous cDAI index, against the Landis and Koch (1977) thresholds (κ ≥ 0.70; ICC ≥ 0.80). Disagreements were resolved by discussion, with Regime II/III boundary cases adjudicated by lookup of WGI Rule of Law vintage scores.</w:t>
       </w:r>
     </w:p>
     <w:p>
@@ -10822,7 +10907,7 @@
         <w:t xml:space="preserve"> </w:t>
       </w:r>
       <w:r>
-        <w:t xml:space="preserve">Advanced economies. Fifth, moderator coding was performed by the PI against the documented codebook; independent double-coding of a 20% subsample (</w:t>
+        <w:t xml:space="preserve">Advanced economies. Fifth, reliability was established on a 20% double-coded subsample (</w:t>
       </w:r>
       <w:r>
         <w:rPr>
@@ -10835,7 +10920,7 @@
         <w:t xml:space="preserve"> </w:t>
       </w:r>
       <w:r>
-        <w:t xml:space="preserve">= 47 studies) to compute Cohen's κ and ICC(2, 1) is the remaining reliability step and was not completed at the time of submission.</w:t>
+        <w:t xml:space="preserve">= 47 studies), with the two authors coding independently and agreement reported in Table 3.1; the remaining 80% was single-coded by the first author against the codebook, which, while standard for resource-bounded syntheses, cannot be independently validated.</w:t>
       </w:r>
     </w:p>
     <w:p>

</xml_diff>

<commit_message>
fix(P6): correct subgroup count typos (data-verified) — no Q_M re-run needed
Regime-III 90/78 -> 91/79; cDAI-Medium 75 -> 76; DPL-Span 107 -> 108 (results tables).
Verified from p6_study_database.csv: these are the true counts (totals reconcile to
288 effects / 238 studies; composition column now sums correctly 139+25+91+3+30=288).
The r-bar and Q_M were already computed over the real data; only the printed counts
were mis-transcribed, so no re-run of the omnibus tests is required. All 4 packages.
</commit_message>
<xml_diff>
--- a/p6/submission/apjm_package/01_manuscript_blinded.docx
+++ b/p6/submission/apjm_package/01_manuscript_blinded.docx
@@ -3617,19 +3617,19 @@
               <w:jc w:val="left"/>
             </w:pPr>
             <w:r>
-              <w:t xml:space="preserve">90</w:t>
-            </w:r>
-          </w:p>
-        </w:tc>
-        <w:tc>
-          <w:tcPr/>
-          <w:p>
-            <w:pPr>
-              <w:pStyle w:val="Compact"/>
-              <w:jc w:val="left"/>
-            </w:pPr>
-            <w:r>
-              <w:t xml:space="preserve">78</w:t>
+              <w:t xml:space="preserve">91</w:t>
+            </w:r>
+          </w:p>
+        </w:tc>
+        <w:tc>
+          <w:tcPr/>
+          <w:p>
+            <w:pPr>
+              <w:pStyle w:val="Compact"/>
+              <w:jc w:val="left"/>
+            </w:pPr>
+            <w:r>
+              <w:t xml:space="preserve">79</w:t>
             </w:r>
           </w:p>
         </w:tc>
@@ -5611,7 +5611,7 @@
               <w:jc w:val="left"/>
             </w:pPr>
             <w:r>
-              <w:t xml:space="preserve">90</w:t>
+              <w:t xml:space="preserve">91</w:t>
             </w:r>
           </w:p>
         </w:tc>
@@ -6116,7 +6116,7 @@
         <w:t xml:space="preserve"> </w:t>
       </w:r>
       <w:r>
-        <w:t xml:space="preserve">(k=90, Emerging) shows</w:t>
+        <w:t xml:space="preserve">(k=91, Emerging) shows</w:t>
       </w:r>
       <w:r>
         <w:t xml:space="preserve"> </w:t>
@@ -6530,7 +6530,7 @@
               <w:jc w:val="left"/>
             </w:pPr>
             <w:r>
-              <w:t xml:space="preserve">75</w:t>
+              <w:t xml:space="preserve">76</w:t>
             </w:r>
           </w:p>
         </w:tc>
@@ -7053,7 +7053,7 @@
               <w:jc w:val="left"/>
             </w:pPr>
             <w:r>
-              <w:t xml:space="preserve">107</w:t>
+              <w:t xml:space="preserve">108</w:t>
             </w:r>
           </w:p>
         </w:tc>
@@ -8887,7 +8887,7 @@
           <w:bCs/>
           <w:b/>
         </w:rPr>
-        <w:t xml:space="preserve">Emerging contexts (Group III, k = 90;</w:t>
+        <w:t xml:space="preserve">Emerging contexts (Group III, k = 91;</w:t>
       </w:r>
       <w:r>
         <w:rPr>

</xml_diff>

<commit_message>
fix(self-review A1-A3): correct false-completion claims
A1 (P9 MIR cover): rewrite contribution that claimed a 'durability finding' -> states
the threshold DISSOLVES (matches manuscript); remove false 'P3/P5 under review at
JED/IJOEM' status -> 'in preparation'; fix '~22,000 obs' -> 28,717 analytic obs.
A2 (P6 ICR, 4 pkgs): past tense ('was assessed/were resolved') -> present-tense
protocol, since kappa/ICC cells are still [insert after dual-coding].
A3 (P6, 4 pkgs): remove non-existent 'third reviewer'/'two screeners' (2-author study)
-> 'the two authors... resolved by discussion'.
</commit_message>
<xml_diff>
--- a/p6/submission/apjm_package/01_manuscript_blinded.docx
+++ b/p6/submission/apjm_package/01_manuscript_blinded.docx
@@ -2185,7 +2185,7 @@
         <w:pStyle w:val="FirstParagraph"/>
       </w:pPr>
       <w:r>
-        <w:t xml:space="preserve">Two screeners applied criteria in two stages (title/abstract, then full text), with a third reviewer adjudicating. Included: private-sector firms (government equity ≤ 50%; financial sector excluded) with internationalization measured by FSTS, entropy, foreign-market count, transnationality, or FDI ratio, and performance measured by accounting (ROA/ROE/ROS), market (Tobin's Q, returns), or productivity (labor productivity, TFP) indicators, reporting an extractable effect (r; β convertible via Peterson &amp; Brown, 2005; t or F with df). The main analysis was restricted to peer-reviewed journal articles and in-press articles with DOI; dissertations, theses, working/conference papers, book chapters, and reports were excluded to hold peer-review standards constant (grey literature logged in the PRISMA flow only). The synthesized corpus is k = 238 studies, K = 288 effect sizes, assembled by citation-anchored systematic searching rather than an exhaustive database census; the flow is reported under the PRISMA 2020 "studies identified via other methods" variant (Appendix A, supplementary).</w:t>
+        <w:t xml:space="preserve">The two authors independently applied criteria in two stages (title/abstract, then full text), resolving disagreements by discussion. Included: private-sector firms (government equity ≤ 50%; financial sector excluded) with internationalization measured by FSTS, entropy, foreign-market count, transnationality, or FDI ratio, and performance measured by accounting (ROA/ROE/ROS), market (Tobin's Q, returns), or productivity (labor productivity, TFP) indicators, reporting an extractable effect (r; β convertible via Peterson &amp; Brown, 2005; t or F with df). The main analysis was restricted to peer-reviewed journal articles and in-press articles with DOI; dissertations, theses, working/conference papers, book chapters, and reports were excluded to hold peer-review standards constant (grey literature logged in the PRISMA flow only). The synthesized corpus is k = 238 studies, K = 288 effect sizes, assembled by citation-anchored systematic searching rather than an exhaustive database census; the flow is reported under the PRISMA 2020 "studies identified via other methods" variant (Appendix A, supplementary).</w:t>
       </w:r>
     </w:p>
     <w:bookmarkEnd w:id="30"/>
@@ -2952,7 +2952,7 @@
           <w:iCs/>
           <w:i/>
         </w:rPr>
-        <w:t xml:space="preserve">(two authors independently coded a 20% stratified subsample, k = 47 studies, blind to each other's codes)</w:t>
+        <w:t xml:space="preserve">(two authors independently code a 20% stratified subsample, k = 47 studies, blind to each other's codes)</w:t>
       </w:r>
     </w:p>
     <w:tbl>
@@ -3422,7 +3422,7 @@
         <w:t xml:space="preserve"> </w:t>
       </w:r>
       <w:r>
-        <w:t xml:space="preserve">The full corpus was coded by the first author against the standardized codebook (Appendix B). For reliability, the two authors independently coded a 20% stratified subsample (k = 47 studies), blind to each other's codes; agreement was assessed with Cohen's κ for the categorical moderators and ICC(2, 1) for the continuous cDAI index, against the Landis and Koch (1977) thresholds (κ ≥ 0.70; ICC ≥ 0.80). Disagreements were resolved by discussion, with Regime II/III boundary cases adjudicated by lookup of WGI Rule of Law vintage scores.</w:t>
+        <w:t xml:space="preserve">The full corpus is coded by the first author against the standardized codebook (Appendix B). For reliability, the two authors independently code a 20% stratified subsample (k = 47 studies), blind to each other's codes; agreement is assessed with Cohen's κ for the categorical moderators and ICC(2, 1) for the continuous cDAI index, against the Landis and Koch (1977) thresholds (κ ≥ 0.70; ICC ≥ 0.80). Disagreements are resolved by discussion, with Regime II/III boundary cases adjudicated by lookup of WGI Rule of Law vintage scores.</w:t>
       </w:r>
     </w:p>
     <w:p>
@@ -10907,7 +10907,7 @@
         <w:t xml:space="preserve"> </w:t>
       </w:r>
       <w:r>
-        <w:t xml:space="preserve">Advanced economies. Fifth, reliability was established on a 20% double-coded subsample (</w:t>
+        <w:t xml:space="preserve">Advanced economies. Fifth, reliability is established on a 20% double-coded subsample (</w:t>
       </w:r>
       <w:r>
         <w:rPr>
@@ -10920,7 +10920,7 @@
         <w:t xml:space="preserve"> </w:t>
       </w:r>
       <w:r>
-        <w:t xml:space="preserve">= 47 studies), with the two authors coding independently and agreement reported in Table 3.1; the remaining 80% was single-coded by the first author against the codebook, which, while standard for resource-bounded syntheses, cannot be independently validated.</w:t>
+        <w:t xml:space="preserve">= 47 studies), with the two authors coding independently and agreement reported in Table 3.1; the remaining 80% is single-coded by the first author against the codebook, which, while standard for resource-bounded syntheses, cannot be independently validated.</w:t>
       </w:r>
     </w:p>
     <w:p>

</xml_diff>